<commit_message>
fix(proposal-generator#2390): % → @ raw XML tags, Fortress → NBA Insurance Services branding
Co-Authored-By: Claude Sonnet 4.6 <noreply@anthropic.com>
</commit_message>
<xml_diff>
--- a/services/proposal-generator/templates/verticals/nba/master.docx
+++ b/services/proposal-generator/templates/verticals/nba/master.docx
@@ -60,7 +60,7 @@
     </w:p>
     <w:p>
       <w:r>
-        <w:t>Fortress Agency Management</w:t>
+        <w:t>NBA Insurance Services</w:t>
       </w:r>
     </w:p>
     <w:p>
@@ -270,7 +270,7 @@
     </w:p>
     <w:p>
       <w:r>
-        <w:t>{%lobSectionsXml}</w:t>
+        <w:t>{@lobSectionsXml}</w:t>
       </w:r>
     </w:p>
     <w:p>
@@ -735,7 +735,7 @@
     </w:p>
     <w:p>
       <w:r>
-        <w:t>{%boilerplateSectionsXml}</w:t>
+        <w:t>{@boilerplateSectionsXml}</w:t>
       </w:r>
     </w:p>
     <w:sectPr>

</xml_diff>